<commit_message>
Actualiza el documento Word de la actividad autonoma 07
</commit_message>
<xml_diff>
--- a/docs/entrega/Entrega_S07_ActividadAutonoma.docx
+++ b/docs/entrega/Entrega_S07_ActividadAutonoma.docx
@@ -49,8 +49,86 @@
       </w:r>
     </w:p>
     <w:p>
+      <w:pPr>
+        <w:jc w:val="center"/>
+      </w:pPr>
       <w:r>
         <w:t>Documentación de endpoints, DTO y pruebas de conexión</w:t>
+      </w:r>
+    </w:p>
+    <w:p>
+      <w:pPr>
+        <w:jc w:val="center"/>
+      </w:pPr>
+      <w:r>
+        <w:rPr>
+          <w:b/>
+        </w:rPr>
+        <w:t>Estudiante:</w:t>
+      </w:r>
+      <w:r>
+        <w:t xml:space="preserve"> Fabian Rodríguez Bazán</w:t>
+      </w:r>
+    </w:p>
+    <w:p>
+      <w:pPr>
+        <w:jc w:val="center"/>
+      </w:pPr>
+      <w:r>
+        <w:rPr>
+          <w:b/>
+        </w:rPr>
+        <w:t>Curso:</w:t>
+      </w:r>
+      <w:r>
+        <w:t xml:space="preserve"> Desarrollo de Aplicaciones Móviles</w:t>
+      </w:r>
+    </w:p>
+    <w:p>
+      <w:pPr>
+        <w:jc w:val="center"/>
+      </w:pPr>
+      <w:r>
+        <w:rPr>
+          <w:b/>
+        </w:rPr>
+        <w:t>Sesión:</w:t>
+      </w:r>
+      <w:r>
+        <w:t xml:space="preserve"> 07 (Unidad 2, Sesión 1)</w:t>
+      </w:r>
+    </w:p>
+    <w:p>
+      <w:pPr>
+        <w:jc w:val="center"/>
+      </w:pPr>
+      <w:r>
+        <w:rPr>
+          <w:b/>
+        </w:rPr>
+        <w:t>Fecha:</w:t>
+      </w:r>
+      <w:r>
+        <w:t xml:space="preserve"> 01/10/2026</w:t>
+      </w:r>
+    </w:p>
+    <w:p>
+      <w:pPr>
+        <w:jc w:val="center"/>
+      </w:pPr>
+      <w:r>
+        <w:rPr>
+          <w:b/>
+        </w:rPr>
+        <w:t>Repositorio:</w:t>
+      </w:r>
+      <w:r>
+        <w:t xml:space="preserve"> https://github.com/fabianrodriguez33/Pharma-Mobil</w:t>
+      </w:r>
+    </w:p>
+    <w:p>
+      <w:r>
+        <w:br w:type="page"/>
       </w:r>
     </w:p>
     <w:p>
@@ -1505,38 +1583,6 @@
               </w:rPr>
               <w:t>CategoriaDto?</w:t>
             </w:r>
-            <w:r>
-              <w:rPr>
-                <w:sz w:val="17"/>
-              </w:rPr>
-              <w:t xml:space="preserve"> (</w:t>
-            </w:r>
-            <w:r>
-              <w:rPr>
-                <w:rFonts w:ascii="Consolas" w:hAnsi="Consolas"/>
-                <w:sz w:val="17"/>
-              </w:rPr>
-              <w:t>id</w:t>
-            </w:r>
-            <w:r>
-              <w:rPr>
-                <w:sz w:val="17"/>
-              </w:rPr>
-              <w:t xml:space="preserve">, </w:t>
-            </w:r>
-            <w:r>
-              <w:rPr>
-                <w:rFonts w:ascii="Consolas" w:hAnsi="Consolas"/>
-                <w:sz w:val="17"/>
-              </w:rPr>
-              <w:t>name</w:t>
-            </w:r>
-            <w:r>
-              <w:rPr>
-                <w:sz w:val="17"/>
-              </w:rPr>
-              <w:t>)</w:t>
-            </w:r>
           </w:p>
         </w:tc>
         <w:tc>
@@ -1678,6 +1724,357 @@
       </w:tr>
     </w:tbl>
     <w:p/>
+    <w:p>
+      <w:pPr>
+        <w:pStyle w:val="Heading3"/>
+      </w:pPr>
+      <w:r>
+        <w:t>Tabla de Mapeo: `CategoriaDto` (subobjeto `category`)</w:t>
+      </w:r>
+    </w:p>
+    <w:tbl>
+      <w:tblPr>
+        <w:tblStyle w:val="TableGrid"/>
+        <w:tblW w:type="auto" w:w="0"/>
+        <w:tblLook w:firstColumn="1" w:firstRow="1" w:lastColumn="0" w:lastRow="0" w:noHBand="0" w:noVBand="1" w:val="04A0"/>
+      </w:tblPr>
+      <w:tblGrid>
+        <w:gridCol w:w="1700"/>
+        <w:gridCol w:w="1700"/>
+        <w:gridCol w:w="1700"/>
+        <w:gridCol w:w="1700"/>
+        <w:gridCol w:w="1700"/>
+        <w:gridCol w:w="1700"/>
+      </w:tblGrid>
+      <w:tr>
+        <w:tc>
+          <w:tcPr>
+            <w:tcW w:type="dxa" w:w="1700"/>
+            <w:shd w:val="clear" w:fill="0F5C4D"/>
+          </w:tcPr>
+          <w:p>
+            <w:r>
+              <w:rPr>
+                <w:b/>
+                <w:color w:val="FFFFFF"/>
+                <w:sz w:val="17"/>
+              </w:rPr>
+              <w:t>Campo JSON</w:t>
+            </w:r>
+          </w:p>
+        </w:tc>
+        <w:tc>
+          <w:tcPr>
+            <w:tcW w:type="dxa" w:w="1700"/>
+            <w:shd w:val="clear" w:fill="0F5C4D"/>
+          </w:tcPr>
+          <w:p>
+            <w:r>
+              <w:rPr>
+                <w:b/>
+                <w:color w:val="FFFFFF"/>
+                <w:sz w:val="17"/>
+              </w:rPr>
+              <w:t>Tipo en Kotlin (DTO)</w:t>
+            </w:r>
+          </w:p>
+        </w:tc>
+        <w:tc>
+          <w:tcPr>
+            <w:tcW w:type="dxa" w:w="1700"/>
+            <w:shd w:val="clear" w:fill="0F5C4D"/>
+          </w:tcPr>
+          <w:p>
+            <w:r>
+              <w:rPr>
+                <w:b/>
+                <w:color w:val="FFFFFF"/>
+                <w:sz w:val="17"/>
+              </w:rPr>
+              <w:t>Obligatorio</w:t>
+            </w:r>
+          </w:p>
+        </w:tc>
+        <w:tc>
+          <w:tcPr>
+            <w:tcW w:type="dxa" w:w="1700"/>
+            <w:shd w:val="clear" w:fill="0F5C4D"/>
+          </w:tcPr>
+          <w:p>
+            <w:r>
+              <w:rPr>
+                <w:b/>
+                <w:color w:val="FFFFFF"/>
+                <w:sz w:val="17"/>
+              </w:rPr>
+              <w:t>Valor por Defecto</w:t>
+            </w:r>
+          </w:p>
+        </w:tc>
+        <w:tc>
+          <w:tcPr>
+            <w:tcW w:type="dxa" w:w="1700"/>
+            <w:shd w:val="clear" w:fill="0F5C4D"/>
+          </w:tcPr>
+          <w:p>
+            <w:r>
+              <w:rPr>
+                <w:b/>
+                <w:color w:val="FFFFFF"/>
+                <w:sz w:val="17"/>
+              </w:rPr>
+              <w:t>Campo Dominio</w:t>
+            </w:r>
+          </w:p>
+        </w:tc>
+        <w:tc>
+          <w:tcPr>
+            <w:tcW w:type="dxa" w:w="1700"/>
+            <w:shd w:val="clear" w:fill="0F5C4D"/>
+          </w:tcPr>
+          <w:p>
+            <w:r>
+              <w:rPr>
+                <w:b/>
+                <w:color w:val="FFFFFF"/>
+                <w:sz w:val="17"/>
+              </w:rPr>
+              <w:t>Transformación / Regla de Negocio</w:t>
+            </w:r>
+          </w:p>
+        </w:tc>
+      </w:tr>
+      <w:tr>
+        <w:tc>
+          <w:tcPr>
+            <w:tcW w:type="dxa" w:w="1700"/>
+          </w:tcPr>
+          <w:p>
+            <w:r>
+              <w:rPr>
+                <w:rFonts w:ascii="Consolas" w:hAnsi="Consolas"/>
+                <w:sz w:val="17"/>
+              </w:rPr>
+              <w:t>id</w:t>
+            </w:r>
+          </w:p>
+        </w:tc>
+        <w:tc>
+          <w:tcPr>
+            <w:tcW w:type="dxa" w:w="1700"/>
+          </w:tcPr>
+          <w:p>
+            <w:r>
+              <w:rPr>
+                <w:rFonts w:ascii="Consolas" w:hAnsi="Consolas"/>
+                <w:sz w:val="17"/>
+              </w:rPr>
+              <w:t>Int</w:t>
+            </w:r>
+          </w:p>
+        </w:tc>
+        <w:tc>
+          <w:tcPr>
+            <w:tcW w:type="dxa" w:w="1700"/>
+          </w:tcPr>
+          <w:p>
+            <w:r>
+              <w:rPr>
+                <w:sz w:val="17"/>
+              </w:rPr>
+              <w:t>Sí</w:t>
+            </w:r>
+          </w:p>
+        </w:tc>
+        <w:tc>
+          <w:tcPr>
+            <w:tcW w:type="dxa" w:w="1700"/>
+          </w:tcPr>
+          <w:p>
+            <w:r>
+              <w:rPr>
+                <w:sz w:val="17"/>
+              </w:rPr>
+              <w:t>N/A</w:t>
+            </w:r>
+          </w:p>
+        </w:tc>
+        <w:tc>
+          <w:tcPr>
+            <w:tcW w:type="dxa" w:w="1700"/>
+          </w:tcPr>
+          <w:p>
+            <w:r>
+              <w:rPr>
+                <w:sz w:val="17"/>
+              </w:rPr>
+              <w:t>N/A</w:t>
+            </w:r>
+          </w:p>
+        </w:tc>
+        <w:tc>
+          <w:tcPr>
+            <w:tcW w:type="dxa" w:w="1700"/>
+          </w:tcPr>
+          <w:p>
+            <w:r>
+              <w:rPr>
+                <w:sz w:val="17"/>
+              </w:rPr>
+              <w:t>No se mapea al dominio.</w:t>
+            </w:r>
+          </w:p>
+        </w:tc>
+      </w:tr>
+      <w:tr>
+        <w:tc>
+          <w:tcPr>
+            <w:tcW w:type="dxa" w:w="1700"/>
+          </w:tcPr>
+          <w:p>
+            <w:r>
+              <w:rPr>
+                <w:rFonts w:ascii="Consolas" w:hAnsi="Consolas"/>
+                <w:sz w:val="17"/>
+              </w:rPr>
+              <w:t>name</w:t>
+            </w:r>
+          </w:p>
+        </w:tc>
+        <w:tc>
+          <w:tcPr>
+            <w:tcW w:type="dxa" w:w="1700"/>
+          </w:tcPr>
+          <w:p>
+            <w:r>
+              <w:rPr>
+                <w:rFonts w:ascii="Consolas" w:hAnsi="Consolas"/>
+                <w:sz w:val="17"/>
+              </w:rPr>
+              <w:t>String</w:t>
+            </w:r>
+          </w:p>
+        </w:tc>
+        <w:tc>
+          <w:tcPr>
+            <w:tcW w:type="dxa" w:w="1700"/>
+          </w:tcPr>
+          <w:p>
+            <w:r>
+              <w:rPr>
+                <w:sz w:val="17"/>
+              </w:rPr>
+              <w:t>Sí</w:t>
+            </w:r>
+          </w:p>
+        </w:tc>
+        <w:tc>
+          <w:tcPr>
+            <w:tcW w:type="dxa" w:w="1700"/>
+          </w:tcPr>
+          <w:p>
+            <w:r>
+              <w:rPr>
+                <w:sz w:val="17"/>
+              </w:rPr>
+              <w:t>N/A</w:t>
+            </w:r>
+          </w:p>
+        </w:tc>
+        <w:tc>
+          <w:tcPr>
+            <w:tcW w:type="dxa" w:w="1700"/>
+          </w:tcPr>
+          <w:p>
+            <w:r>
+              <w:rPr>
+                <w:sz w:val="17"/>
+              </w:rPr>
+              <w:t>N/A</w:t>
+            </w:r>
+          </w:p>
+        </w:tc>
+        <w:tc>
+          <w:tcPr>
+            <w:tcW w:type="dxa" w:w="1700"/>
+          </w:tcPr>
+          <w:p>
+            <w:r>
+              <w:rPr>
+                <w:sz w:val="17"/>
+              </w:rPr>
+              <w:t>No se mapea al dominio.</w:t>
+            </w:r>
+          </w:p>
+        </w:tc>
+      </w:tr>
+    </w:tbl>
+    <w:p/>
+    <w:p>
+      <w:r>
+        <w:t xml:space="preserve">Los demás campos de </w:t>
+      </w:r>
+      <w:r>
+        <w:rPr>
+          <w:rFonts w:ascii="Consolas" w:hAnsi="Consolas"/>
+          <w:sz w:val="18"/>
+        </w:rPr>
+        <w:t>category</w:t>
+      </w:r>
+      <w:r>
+        <w:t xml:space="preserve"> que envía la API (</w:t>
+      </w:r>
+      <w:r>
+        <w:rPr>
+          <w:rFonts w:ascii="Consolas" w:hAnsi="Consolas"/>
+          <w:sz w:val="18"/>
+        </w:rPr>
+        <w:t>slug</w:t>
+      </w:r>
+      <w:r>
+        <w:t xml:space="preserve">, </w:t>
+      </w:r>
+      <w:r>
+        <w:rPr>
+          <w:rFonts w:ascii="Consolas" w:hAnsi="Consolas"/>
+          <w:sz w:val="18"/>
+        </w:rPr>
+        <w:t>image</w:t>
+      </w:r>
+      <w:r>
+        <w:t xml:space="preserve">, </w:t>
+      </w:r>
+      <w:r>
+        <w:rPr>
+          <w:rFonts w:ascii="Consolas" w:hAnsi="Consolas"/>
+          <w:sz w:val="18"/>
+        </w:rPr>
+        <w:t>creationAt</w:t>
+      </w:r>
+      <w:r>
+        <w:t xml:space="preserve">, </w:t>
+      </w:r>
+      <w:r>
+        <w:rPr>
+          <w:rFonts w:ascii="Consolas" w:hAnsi="Consolas"/>
+          <w:sz w:val="18"/>
+        </w:rPr>
+        <w:t>updatedAt</w:t>
+      </w:r>
+      <w:r>
+        <w:t xml:space="preserve">) no están declarados en el DTO y se ignoran con </w:t>
+      </w:r>
+      <w:r>
+        <w:rPr>
+          <w:rFonts w:ascii="Consolas" w:hAnsi="Consolas"/>
+          <w:sz w:val="18"/>
+        </w:rPr>
+        <w:t>ignoreUnknownKeys</w:t>
+      </w:r>
+      <w:r>
+        <w:t>.</w:t>
+      </w:r>
+    </w:p>
     <w:p>
       <w:pPr>
         <w:pStyle w:val="Heading3"/>
@@ -2006,26 +2403,13 @@
                 <w:rFonts w:ascii="Consolas" w:hAnsi="Consolas"/>
                 <w:sz w:val="17"/>
               </w:rPr>
-              <w:t>REQUEST .../products?offset=0&amp;limit=10</w:t>
-            </w:r>
-            <w:r>
-              <w:rPr>
-                <w:sz w:val="17"/>
-              </w:rPr>
-              <w:t xml:space="preserve"> y </w:t>
-            </w:r>
-            <w:r>
-              <w:rPr>
-                <w:rFonts w:ascii="Consolas" w:hAnsi="Consolas"/>
-                <w:sz w:val="17"/>
-              </w:rPr>
               <w:t>RESPONSE: 200</w:t>
             </w:r>
             <w:r>
               <w:rPr>
                 <w:sz w:val="17"/>
               </w:rPr>
-              <w:t>. La cuadrícula muestra 10 productos con imagen y precio (Evidencia 1 y 2).</w:t>
+              <w:t>. La cuadrícula muestra 10 productos con imagen y precio (Evidencias 1 y 2).</w:t>
             </w:r>
           </w:p>
         </w:tc>
@@ -2051,7 +2435,7 @@
               <w:rPr>
                 <w:sz w:val="17"/>
               </w:rPr>
-              <w:t>: la interfaz despliega el catálogo.</w:t>
+              <w:t>. El usuario ve el catálogo; no hay mensaje de error.</w:t>
             </w:r>
           </w:p>
         </w:tc>
@@ -2091,16 +2475,48 @@
           <w:p>
             <w:r>
               <w:rPr>
+                <w:sz w:val="17"/>
+              </w:rPr>
+              <w:t xml:space="preserve">Temporalmente se pidió </w:t>
+            </w:r>
+            <w:r>
+              <w:rPr>
                 <w:rFonts w:ascii="Consolas" w:hAnsi="Consolas"/>
                 <w:sz w:val="17"/>
               </w:rPr>
-              <w:t>GET /api/v1/products/999999</w:t>
+              <w:t>GET /products</w:t>
             </w:r>
             <w:r>
               <w:rPr>
                 <w:sz w:val="17"/>
               </w:rPr>
-              <w:t xml:space="preserve"> (curl; la app solo implementa el listado).</w:t>
+              <w:t xml:space="preserve"> como </w:t>
+            </w:r>
+            <w:r>
+              <w:rPr>
+                <w:rFonts w:ascii="Consolas" w:hAnsi="Consolas"/>
+                <w:sz w:val="17"/>
+              </w:rPr>
+              <w:t>/productos</w:t>
+            </w:r>
+            <w:r>
+              <w:rPr>
+                <w:sz w:val="17"/>
+              </w:rPr>
+              <w:t xml:space="preserve"> con </w:t>
+            </w:r>
+            <w:r>
+              <w:rPr>
+                <w:rFonts w:ascii="Consolas" w:hAnsi="Consolas"/>
+                <w:sz w:val="17"/>
+              </w:rPr>
+              <w:t>expectSuccess = true</w:t>
+            </w:r>
+            <w:r>
+              <w:rPr>
+                <w:sz w:val="17"/>
+              </w:rPr>
+              <w:t xml:space="preserve"> (código revertido después).</w:t>
             </w:r>
           </w:p>
         </w:tc>
@@ -2120,6 +2536,19 @@
               <w:rPr>
                 <w:sz w:val="17"/>
               </w:rPr>
+              <w:t xml:space="preserve"> y </w:t>
+            </w:r>
+            <w:r>
+              <w:rPr>
+                <w:rFonts w:ascii="Consolas" w:hAnsi="Consolas"/>
+                <w:sz w:val="17"/>
+              </w:rPr>
+              <w:t>ClientRequestException</w:t>
+            </w:r>
+            <w:r>
+              <w:rPr>
+                <w:sz w:val="17"/>
+              </w:rPr>
               <w:t>.</w:t>
             </w:r>
           </w:p>
@@ -2133,33 +2562,20 @@
               <w:rPr>
                 <w:sz w:val="17"/>
               </w:rPr>
-              <w:t xml:space="preserve">La API de práctica respondió </w:t>
-            </w:r>
-            <w:r>
-              <w:rPr>
-                <w:b/>
-                <w:sz w:val="17"/>
-              </w:rPr>
-              <w:t>HTTP 400</w:t>
-            </w:r>
-            <w:r>
-              <w:rPr>
-                <w:sz w:val="17"/>
-              </w:rPr>
-              <w:t xml:space="preserve"> con </w:t>
+              <w:t xml:space="preserve">Log: </w:t>
             </w:r>
             <w:r>
               <w:rPr>
                 <w:rFonts w:ascii="Consolas" w:hAnsi="Consolas"/>
                 <w:sz w:val="17"/>
               </w:rPr>
-              <w:t>EntityNotFoundError</w:t>
+              <w:t>RESPONSE: 404</w:t>
             </w:r>
             <w:r>
               <w:rPr>
                 <w:sz w:val="17"/>
               </w:rPr>
-              <w:t xml:space="preserve"> (no existe la entidad). El código de error difiere del 404 esperado.</w:t>
+              <w:t xml:space="preserve"> (Evidencia 4).</w:t>
             </w:r>
           </w:p>
         </w:tc>
@@ -2172,20 +2588,7 @@
               <w:rPr>
                 <w:sz w:val="17"/>
               </w:rPr>
-              <w:t xml:space="preserve">Ktor lanzaría </w:t>
-            </w:r>
-            <w:r>
-              <w:rPr>
-                <w:rFonts w:ascii="Consolas" w:hAnsi="Consolas"/>
-                <w:sz w:val="17"/>
-              </w:rPr>
-              <w:t>ClientRequestException</w:t>
-            </w:r>
-            <w:r>
-              <w:rPr>
-                <w:sz w:val="17"/>
-              </w:rPr>
-              <w:t xml:space="preserve"> (4xx); la UI mostraría el estado </w:t>
+              <w:t xml:space="preserve">Estado </w:t>
             </w:r>
             <w:r>
               <w:rPr>
@@ -2198,7 +2601,20 @@
               <w:rPr>
                 <w:sz w:val="17"/>
               </w:rPr>
-              <w:t xml:space="preserve"> con opción "Reintentar".</w:t>
+              <w:t xml:space="preserve">. El usuario ve «No pudimos cargar los productos» y debajo: </w:t>
+            </w:r>
+            <w:r>
+              <w:rPr>
+                <w:rFonts w:ascii="Consolas" w:hAnsi="Consolas"/>
+                <w:sz w:val="17"/>
+              </w:rPr>
+              <w:t>Client request(GET https://api.escuelajs.co/api/v1/productos?offset=0&amp;limit=10) invalid: 404 . Text: {"message":"Cannot GET /api/v1/productos?offset=0&amp;limit=10","error":"Not Found","statusCode":404}</w:t>
+            </w:r>
+            <w:r>
+              <w:rPr>
+                <w:sz w:val="17"/>
+              </w:rPr>
+              <w:t>, con el botón «Reintentar».</w:t>
             </w:r>
           </w:p>
         </w:tc>
@@ -2240,7 +2656,7 @@
               <w:rPr>
                 <w:sz w:val="17"/>
               </w:rPr>
-              <w:t xml:space="preserve">Activar Modo Avión con </w:t>
+              <w:t xml:space="preserve">Modo Avión activado con </w:t>
             </w:r>
             <w:r>
               <w:rPr>
@@ -2299,7 +2715,7 @@
               <w:rPr>
                 <w:sz w:val="17"/>
               </w:rPr>
-              <w:t>. Pantalla con icono de nube tachada, "No pudimos cargar los productos" y botón "Reintentar" (Evidencia 3).</w:t>
+              <w:t xml:space="preserve"> (Evidencias 1 y 3).</w:t>
             </w:r>
           </w:p>
         </w:tc>
@@ -2325,7 +2741,20 @@
               <w:rPr>
                 <w:sz w:val="17"/>
               </w:rPr>
-              <w:t>: la app no se cierra y permite reintentar al restaurar la red.</w:t>
+              <w:t xml:space="preserve">. El usuario ve «No pudimos cargar los productos» y debajo: </w:t>
+            </w:r>
+            <w:r>
+              <w:rPr>
+                <w:rFonts w:ascii="Consolas" w:hAnsi="Consolas"/>
+                <w:sz w:val="17"/>
+              </w:rPr>
+              <w:t>Unable to resolve host "api.escuelajs.co": No address associated with hostname</w:t>
+            </w:r>
+            <w:r>
+              <w:rPr>
+                <w:sz w:val="17"/>
+              </w:rPr>
+              <w:t>, con el botón «Reintentar» y el icono de nube tachada.</w:t>
             </w:r>
           </w:p>
         </w:tc>
@@ -2367,40 +2796,20 @@
               <w:rPr>
                 <w:sz w:val="17"/>
               </w:rPr>
-              <w:t xml:space="preserve">Cliente configurado con </w:t>
+              <w:t xml:space="preserve">Temporalmente </w:t>
             </w:r>
             <w:r>
               <w:rPr>
                 <w:rFonts w:ascii="Consolas" w:hAnsi="Consolas"/>
                 <w:sz w:val="17"/>
               </w:rPr>
-              <w:t>requestTimeoutMillis = 15_000</w:t>
+              <w:t>requestTimeoutMillis = 1</w:t>
             </w:r>
             <w:r>
               <w:rPr>
                 <w:sz w:val="17"/>
               </w:rPr>
-              <w:t xml:space="preserve"> (no se forzó a 1 ms en esta corrida).</w:t>
-            </w:r>
-          </w:p>
-        </w:tc>
-        <w:tc>
-          <w:tcPr>
-            <w:tcW w:type="dxa" w:w="1700"/>
-          </w:tcPr>
-          <w:p>
-            <w:r>
-              <w:rPr>
-                <w:rFonts w:ascii="Consolas" w:hAnsi="Consolas"/>
-                <w:sz w:val="17"/>
-              </w:rPr>
-              <w:t>HttpRequestTimeoutException</w:t>
-            </w:r>
-            <w:r>
-              <w:rPr>
-                <w:sz w:val="17"/>
-              </w:rPr>
-              <w:t xml:space="preserve"> al superarse el límite.</w:t>
+              <w:t xml:space="preserve"> ms (revertido después) -&gt; abrir "Catálogo".</w:t>
             </w:r>
           </w:p>
         </w:tc>
@@ -2413,20 +2822,33 @@
               <w:rPr>
                 <w:sz w:val="17"/>
               </w:rPr>
-              <w:t xml:space="preserve">No ejecutado en el emulador; se documenta por configuración de </w:t>
+              <w:t>Excepción de tiempo agotado de Ktor.</w:t>
+            </w:r>
+          </w:p>
+        </w:tc>
+        <w:tc>
+          <w:tcPr>
+            <w:tcW w:type="dxa" w:w="1700"/>
+          </w:tcPr>
+          <w:p>
+            <w:r>
+              <w:rPr>
+                <w:sz w:val="17"/>
+              </w:rPr>
+              <w:t xml:space="preserve">Log: </w:t>
             </w:r>
             <w:r>
               <w:rPr>
                 <w:rFonts w:ascii="Consolas" w:hAnsi="Consolas"/>
                 <w:sz w:val="17"/>
               </w:rPr>
-              <w:t>HttpTimeout</w:t>
+              <w:t>failed with exception: java.util.concurrent.CancellationException: Request timeout has expired</w:t>
             </w:r>
             <w:r>
               <w:rPr>
                 <w:sz w:val="17"/>
               </w:rPr>
-              <w:t>.</w:t>
+              <w:t xml:space="preserve"> (Evidencia 5).</w:t>
             </w:r>
           </w:p>
         </w:tc>
@@ -2452,7 +2874,20 @@
               <w:rPr>
                 <w:sz w:val="17"/>
               </w:rPr>
-              <w:t>: la excepción se propaga y la UI ofrece reintento.</w:t>
+              <w:t xml:space="preserve">. El usuario ve «No pudimos cargar los productos» y debajo: </w:t>
+            </w:r>
+            <w:r>
+              <w:rPr>
+                <w:rFonts w:ascii="Consolas" w:hAnsi="Consolas"/>
+                <w:sz w:val="17"/>
+              </w:rPr>
+              <w:t>Request timeout has expired [url=https://api.escuelajs.co/api/v1/products?offset=0&amp;limit=10, request_timeout=1 ms]</w:t>
+            </w:r>
+            <w:r>
+              <w:rPr>
+                <w:sz w:val="17"/>
+              </w:rPr>
+              <w:t>, con el botón «Reintentar».</w:t>
             </w:r>
           </w:p>
         </w:tc>
@@ -2605,7 +3040,7 @@
               <w:rPr>
                 <w:sz w:val="17"/>
               </w:rPr>
-              <w:t>: tolerancia a cambios en la API.</w:t>
+              <w:t>. El usuario ve el catálogo normal; no hay mensaje de error.</w:t>
             </w:r>
           </w:p>
         </w:tc>
@@ -2613,11 +3048,40 @@
     </w:tbl>
     <w:p/>
     <w:p>
+      <w:r>
+        <w:t>Nota: en la app los mensajes de error son el texto de la excepción (</w:t>
+      </w:r>
+      <w:r>
+        <w:rPr>
+          <w:rFonts w:ascii="Consolas" w:hAnsi="Consolas"/>
+          <w:sz w:val="18"/>
+        </w:rPr>
+        <w:t>e.message</w:t>
+      </w:r>
+      <w:r>
+        <w:t>) bajo el título «No pudimos cargar los productos». Los escenarios 2 y 4 se provocaron con modificaciones temporales del código, que no se incluyen en el repositorio.</w:t>
+      </w:r>
+    </w:p>
+    <w:p>
       <w:pPr>
         <w:pStyle w:val="Heading2"/>
       </w:pPr>
       <w:r>
         <w:t>PRODUCTO 4. EVIDENCIAS Y REPOSICIONAMIENTO GIT</w:t>
+      </w:r>
+    </w:p>
+    <w:p>
+      <w:pPr>
+        <w:pStyle w:val="ListBullet"/>
+      </w:pPr>
+      <w:r>
+        <w:rPr>
+          <w:b/>
+        </w:rPr>
+        <w:t>Entorno de pruebas:</w:t>
+      </w:r>
+      <w:r>
+        <w:t xml:space="preserve"> las pruebas de conectividad se ejecutaron exclusivamente en el entorno Android (Pixel 8), por restricciones de sistema operativo; no se incluyen capturas de iOS.</w:t>
       </w:r>
     </w:p>
     <w:p>
@@ -2655,7 +3119,7 @@
         <w:t>UnknownHostException</w:t>
       </w:r>
       <w:r>
-        <w:t xml:space="preserve"> interceptada y mostrada con botón "Reintentar" (Evidencia 3).</w:t>
+        <w:t xml:space="preserve"> interceptada y mostrada con botón "Reintentar" (Evidencia 3); también se probaron el error 404 (Evidencia 4) y el timeout (Evidencia 5).</w:t>
       </w:r>
     </w:p>
     <w:p>
@@ -2843,6 +3307,106 @@
           <w:i/>
         </w:rPr>
         <w:t>Evidencia 3. Estado de error en Modo Avión con botón «Reintentar».</w:t>
+      </w:r>
+    </w:p>
+    <w:p>
+      <w:pPr>
+        <w:jc w:val="center"/>
+      </w:pPr>
+      <w:r>
+        <w:drawing>
+          <wp:inline xmlns:a="http://schemas.openxmlformats.org/drawingml/2006/main" xmlns:pic="http://schemas.openxmlformats.org/drawingml/2006/picture">
+            <wp:extent cx="2340000" cy="5200000"/>
+            <wp:docPr id="4" name="Picture 4"/>
+            <wp:cNvGraphicFramePr>
+              <a:graphicFrameLocks noChangeAspect="1"/>
+            </wp:cNvGraphicFramePr>
+            <a:graphic>
+              <a:graphicData uri="http://schemas.openxmlformats.org/drawingml/2006/picture">
+                <pic:pic>
+                  <pic:nvPicPr>
+                    <pic:cNvPr id="0" name="04-s07-android-error-404.png"/>
+                    <pic:cNvPicPr/>
+                  </pic:nvPicPr>
+                  <pic:blipFill>
+                    <a:blip r:embed="rId12"/>
+                    <a:stretch>
+                      <a:fillRect/>
+                    </a:stretch>
+                  </pic:blipFill>
+                  <pic:spPr>
+                    <a:xfrm>
+                      <a:off x="0" y="0"/>
+                      <a:ext cx="2340000" cy="5200000"/>
+                    </a:xfrm>
+                    <a:prstGeom prst="rect"/>
+                  </pic:spPr>
+                </pic:pic>
+              </a:graphicData>
+            </a:graphic>
+          </wp:inline>
+        </w:drawing>
+      </w:r>
+    </w:p>
+    <w:p>
+      <w:pPr>
+        <w:jc w:val="center"/>
+      </w:pPr>
+      <w:r>
+        <w:rPr>
+          <w:i/>
+        </w:rPr>
+        <w:t>Evidencia 4. Error 404 (prueba temporal) con el mensaje mostrado al usuario.</w:t>
+      </w:r>
+    </w:p>
+    <w:p>
+      <w:pPr>
+        <w:jc w:val="center"/>
+      </w:pPr>
+      <w:r>
+        <w:drawing>
+          <wp:inline xmlns:a="http://schemas.openxmlformats.org/drawingml/2006/main" xmlns:pic="http://schemas.openxmlformats.org/drawingml/2006/picture">
+            <wp:extent cx="2340000" cy="5200000"/>
+            <wp:docPr id="5" name="Picture 5"/>
+            <wp:cNvGraphicFramePr>
+              <a:graphicFrameLocks noChangeAspect="1"/>
+            </wp:cNvGraphicFramePr>
+            <a:graphic>
+              <a:graphicData uri="http://schemas.openxmlformats.org/drawingml/2006/picture">
+                <pic:pic>
+                  <pic:nvPicPr>
+                    <pic:cNvPr id="0" name="05-s07-android-timeout.png"/>
+                    <pic:cNvPicPr/>
+                  </pic:nvPicPr>
+                  <pic:blipFill>
+                    <a:blip r:embed="rId13"/>
+                    <a:stretch>
+                      <a:fillRect/>
+                    </a:stretch>
+                  </pic:blipFill>
+                  <pic:spPr>
+                    <a:xfrm>
+                      <a:off x="0" y="0"/>
+                      <a:ext cx="2340000" cy="5200000"/>
+                    </a:xfrm>
+                    <a:prstGeom prst="rect"/>
+                  </pic:spPr>
+                </pic:pic>
+              </a:graphicData>
+            </a:graphic>
+          </wp:inline>
+        </w:drawing>
+      </w:r>
+    </w:p>
+    <w:p>
+      <w:pPr>
+        <w:jc w:val="center"/>
+      </w:pPr>
+      <w:r>
+        <w:rPr>
+          <w:i/>
+        </w:rPr>
+        <w:t>Evidencia 5. Timeout de 1 ms (prueba temporal) con el mensaje mostrado al usuario.</w:t>
       </w:r>
     </w:p>
     <w:sectPr>

</xml_diff>